<commit_message>
Use a normal cropped portrait photo in Rev16 (no fade)
Co-Authored-By: Claude Sonnet 5.5 <noreply@anthropic.com>
Claude-Session: https://claude.ai/code/session_014NNKuzS1s6RWdAVqcWbkxc
</commit_message>
<xml_diff>
--- a/cv/BUTEC_Personnel_CV_Rev16.docx
+++ b/cv/BUTEC_Personnel_CV_Rev16.docx
@@ -145,7 +145,7 @@
             <w:r>
               <w:drawing>
                 <wp:inline distT="0" distB="0" distL="0" distR="0">
-                  <wp:extent cx="990600" cy="990600"/>
+                  <wp:extent cx="952500" cy="942975"/>
                   <wp:effectExtent t="0" r="0" b="0" l="0"/>
                   <wp:docPr id="1" name="photo" descr="Portrait" title="Photo"/>
                   <wp:cNvGraphicFramePr>
@@ -170,7 +170,7 @@
                         <pic:spPr bwMode="auto">
                           <a:xfrm>
                             <a:off x="0" y="0"/>
-                            <a:ext cx="990600" cy="990600"/>
+                            <a:ext cx="952500" cy="942975"/>
                           </a:xfrm>
                           <a:prstGeom prst="rect">
                             <a:avLst/>

</xml_diff>

<commit_message>
Rev16: photo spans from header rule to the profile heading line
Co-Authored-By: Claude Sonnet 5.5 <noreply@anthropic.com>
Claude-Session: https://claude.ai/code/session_014NNKuzS1s6RWdAVqcWbkxc
</commit_message>
<xml_diff>
--- a/cv/BUTEC_Personnel_CV_Rev16.docx
+++ b/cv/BUTEC_Personnel_CV_Rev16.docx
@@ -15,13 +15,16 @@
         </w:tblBorders>
       </w:tblPr>
       <w:tblGrid>
-        <w:gridCol w:w="7400"/>
-        <w:gridCol w:w="2466"/>
+        <w:gridCol w:w="7866"/>
+        <w:gridCol w:w="2000"/>
       </w:tblGrid>
       <w:tr>
-        <w:tc>
-          <w:tcPr>
-            <w:tcW w:type="dxa" w:w="7400"/>
+        <w:trPr>
+          <w:trHeight w:val="2000" w:hRule="exact"/>
+        </w:trPr>
+        <w:tc>
+          <w:tcPr>
+            <w:tcW w:type="dxa" w:w="7866"/>
             <w:tcBorders>
               <w:top w:val="none" w:color="FFFFFF" w:sz="0"/>
               <w:left w:val="none" w:color="FFFFFF" w:sz="0"/>
@@ -32,7 +35,7 @@
               <w:top w:type="dxa" w:w="0"/>
               <w:left w:type="dxa" w:w="0"/>
               <w:bottom w:type="dxa" w:w="0"/>
-              <w:right w:type="dxa" w:w="0"/>
+              <w:right w:type="dxa" w:w="200"/>
             </w:tcMar>
             <w:vAlign w:val="center"/>
           </w:tcPr>
@@ -123,11 +126,12 @@
         </w:tc>
         <w:tc>
           <w:tcPr>
-            <w:tcW w:type="dxa" w:w="2466"/>
-            <w:tcBorders>
-              <w:top w:val="none" w:color="FFFFFF" w:sz="0"/>
-              <w:left w:val="none" w:color="FFFFFF" w:sz="0"/>
-              <w:bottom w:val="none" w:color="FFFFFF" w:sz="0"/>
+            <w:tcW w:type="dxa" w:w="2000"/>
+            <w:vMerge w:val="restart"/>
+            <w:tcBorders>
+              <w:top w:val="none" w:color="FFFFFF" w:sz="0"/>
+              <w:left w:val="none" w:color="FFFFFF" w:sz="0"/>
+              <w:bottom w:val="single" w:color="DCDCDC" w:sz="6"/>
               <w:right w:val="none" w:color="FFFFFF" w:sz="0"/>
             </w:tcBorders>
             <w:tcMar>
@@ -139,13 +143,13 @@
           </w:tcPr>
           <w:p>
             <w:pPr>
-              <w:spacing w:after="0"/>
+              <w:spacing w:after="0" w:line="240" w:lineRule="auto"/>
               <w:jc w:val="right"/>
             </w:pPr>
             <w:r>
               <w:drawing>
                 <wp:inline distT="0" distB="0" distL="0" distR="0">
-                  <wp:extent cx="952500" cy="942975"/>
+                  <wp:extent cx="1266825" cy="1543050"/>
                   <wp:effectExtent t="0" r="0" b="0" l="0"/>
                   <wp:docPr id="1" name="photo" descr="Portrait" title="Photo"/>
                   <wp:cNvGraphicFramePr>
@@ -161,7 +165,7 @@
                           </pic:cNvPicPr>
                         </pic:nvPicPr>
                         <pic:blipFill>
-                          <a:blip r:embed="rId9" cstate="none"/>
+                          <a:blip r:embed="rId11" cstate="none"/>
                           <a:srcRect/>
                           <a:stretch>
                             <a:fillRect/>
@@ -170,7 +174,7 @@
                         <pic:spPr bwMode="auto">
                           <a:xfrm>
                             <a:off x="0" y="0"/>
-                            <a:ext cx="952500" cy="942975"/>
+                            <a:ext cx="1266825" cy="1543050"/>
                           </a:xfrm>
                           <a:prstGeom prst="rect">
                             <a:avLst/>
@@ -185,47 +189,73 @@
           </w:p>
         </w:tc>
       </w:tr>
+      <w:tr>
+        <w:trPr>
+          <w:trHeight w:val="440" w:hRule="exact"/>
+        </w:trPr>
+        <w:tc>
+          <w:tcPr>
+            <w:tcW w:type="dxa" w:w="7866"/>
+            <w:tcBorders>
+              <w:top w:val="none" w:color="FFFFFF" w:sz="0"/>
+              <w:left w:val="none" w:color="FFFFFF" w:sz="0"/>
+              <w:bottom w:val="single" w:color="DCDCDC" w:sz="6"/>
+              <w:right w:val="none" w:color="FFFFFF" w:sz="0"/>
+            </w:tcBorders>
+            <w:tcMar>
+              <w:top w:type="dxa" w:w="0"/>
+              <w:left w:type="dxa" w:w="0"/>
+              <w:bottom w:type="dxa" w:w="40"/>
+              <w:right w:type="dxa" w:w="0"/>
+            </w:tcMar>
+            <w:vAlign w:val="bottom"/>
+          </w:tcPr>
+          <w:p>
+            <w:pPr>
+              <w:spacing w:after="0"/>
+            </w:pPr>
+            <w:r>
+              <w:rPr>
+                <w:rFonts w:ascii="Arial" w:cs="Arial" w:eastAsia="Arial" w:hAnsi="Arial"/>
+                <w:b/>
+                <w:bCs/>
+                <w:color w:val="FAA21C"/>
+                <w:sz w:val="18"/>
+                <w:szCs w:val="18"/>
+              </w:rPr>
+              <w:t xml:space="preserve">01  </w:t>
+            </w:r>
+            <w:r>
+              <w:rPr>
+                <w:rFonts w:ascii="Arial" w:cs="Arial" w:eastAsia="Arial" w:hAnsi="Arial"/>
+                <w:b/>
+                <w:bCs/>
+                <w:color w:val="161616"/>
+                <w:spacing w:val="40"/>
+                <w:sz w:val="18"/>
+                <w:szCs w:val="18"/>
+              </w:rPr>
+              <w:t xml:space="preserve">PROFESSIONAL PROFILE</w:t>
+            </w:r>
+          </w:p>
+        </w:tc>
+        <w:tc>
+          <w:tcPr>
+            <w:vMerge w:val="continue"/>
+            <w:tcBorders>
+              <w:top w:val="none" w:color="FFFFFF" w:sz="0"/>
+              <w:left w:val="none" w:color="FFFFFF" w:sz="0"/>
+              <w:bottom w:val="single" w:color="DCDCDC" w:sz="6"/>
+              <w:right w:val="none" w:color="FFFFFF" w:sz="0"/>
+            </w:tcBorders>
+          </w:tcPr>
+          <w:p/>
+        </w:tc>
+      </w:tr>
     </w:tbl>
     <w:p>
       <w:pPr>
-        <w:spacing w:after="0"/>
-      </w:pPr>
-    </w:p>
-    <w:p>
-      <w:pPr>
-        <w:keepNext/>
-        <w:pBdr>
-          <w:bottom w:val="single" w:color="DCDCDC" w:sz="6" w:space="3"/>
-        </w:pBdr>
-        <w:spacing w:after="110" w:before="240"/>
-      </w:pPr>
-      <w:r>
-        <w:rPr>
-          <w:rFonts w:ascii="Arial" w:cs="Arial" w:eastAsia="Arial" w:hAnsi="Arial"/>
-          <w:b/>
-          <w:bCs/>
-          <w:color w:val="FAA21C"/>
-          <w:sz w:val="18"/>
-          <w:szCs w:val="18"/>
-        </w:rPr>
-        <w:t xml:space="preserve">01  </w:t>
-      </w:r>
-      <w:r>
-        <w:rPr>
-          <w:rFonts w:ascii="Arial" w:cs="Arial" w:eastAsia="Arial" w:hAnsi="Arial"/>
-          <w:b/>
-          <w:bCs/>
-          <w:color w:val="161616"/>
-          <w:spacing w:val="40"/>
-          <w:sz w:val="18"/>
-          <w:szCs w:val="18"/>
-        </w:rPr>
-        <w:t xml:space="preserve">PROFESSIONAL PROFILE</w:t>
-      </w:r>
-    </w:p>
-    <w:p>
-      <w:pPr>
-        <w:spacing w:after="140" w:line="276"/>
+        <w:spacing w:after="140" w:before="120" w:line="276"/>
       </w:pPr>
       <w:r>
         <w:rPr>
@@ -1534,12 +1564,23 @@
     </w:tbl>
     <w:p>
       <w:pPr>
+        <w:sectPr>
+          <w:headerReference w:type="default" r:id="rId7"/>
+          <w:footerReference w:type="default" r:id="rId8"/>
+          <w:pgSz w:w="11906" w:h="16838" w:orient="portrait"/>
+          <w:pgMar w:top="1000" w:right="1020" w:bottom="1000" w:left="1020" w:header="560" w:footer="480" w:gutter="0"/>
+          <w:pgNumType/>
+          <w:docGrid w:linePitch="360"/>
+        </w:sectPr>
+      </w:pPr>
+    </w:p>
+    <w:p>
+      <w:pPr>
         <w:keepNext/>
-        <w:pageBreakBefore/>
         <w:pBdr>
           <w:bottom w:val="single" w:color="DCDCDC" w:sz="6" w:space="3"/>
         </w:pBdr>
-        <w:spacing w:after="110" w:before="0"/>
+        <w:spacing w:after="110" w:before="240"/>
       </w:pPr>
       <w:r>
         <w:rPr>
@@ -2791,8 +2832,9 @@
       </w:r>
     </w:p>
     <w:sectPr>
-      <w:headerReference w:type="default" r:id="rId7"/>
-      <w:footerReference w:type="default" r:id="rId8"/>
+      <w:headerReference w:type="default" r:id="rId9"/>
+      <w:footerReference w:type="default" r:id="rId10"/>
+      <w:type w:val="nextPage"/>
       <w:pgSz w:w="11906" w:h="16838" w:orient="portrait"/>
       <w:pgMar w:top="1250" w:right="1020" w:bottom="1000" w:left="1020" w:header="560" w:footer="480" w:gutter="0"/>
       <w:pgNumType/>
@@ -2917,6 +2959,80 @@
 </w:ftr>
 </file>
 
+<file path=word/footer2.xml><?xml version="1.0" encoding="utf-8"?>
+<w:ftr xmlns:wpc="http://schemas.microsoft.com/office/word/2010/wordprocessingCanvas" xmlns:mc="http://schemas.openxmlformats.org/markup-compatibility/2006" xmlns:o="urn:schemas-microsoft-com:office:office" xmlns:r="http://schemas.openxmlformats.org/officeDocument/2006/relationships" xmlns:m="http://schemas.openxmlformats.org/officeDocument/2006/math" xmlns:v="urn:schemas-microsoft-com:vml" xmlns:wp14="http://schemas.microsoft.com/office/word/2010/wordprocessingDrawing" xmlns:wp="http://schemas.openxmlformats.org/drawingml/2006/wordprocessingDrawing" xmlns:w10="urn:schemas-microsoft-com:office:word" xmlns:w="http://schemas.openxmlformats.org/wordprocessingml/2006/main" xmlns:w14="http://schemas.microsoft.com/office/word/2010/wordml" xmlns:w15="http://schemas.microsoft.com/office/word/2012/wordml" xmlns:wpg="http://schemas.microsoft.com/office/word/2010/wordprocessingGroup" xmlns:wpi="http://schemas.microsoft.com/office/word/2010/wordprocessingInk" xmlns:wne="http://schemas.microsoft.com/office/word/2006/wordml" xmlns:wps="http://schemas.microsoft.com/office/word/2010/wordprocessingShape">
+  <w:p>
+    <w:pPr>
+      <w:tabs>
+        <w:tab w:val="right" w:pos="9866"/>
+      </w:tabs>
+      <w:spacing w:before="0"/>
+      <w:rPr>
+        <w:rFonts w:ascii="Arial" w:cs="Arial" w:eastAsia="Arial" w:hAnsi="Arial"/>
+        <w:color w:val="6A6A6A"/>
+        <w:sz w:val="15"/>
+        <w:szCs w:val="15"/>
+      </w:rPr>
+    </w:pPr>
+    <w:r>
+      <w:rPr>
+        <w:rFonts w:ascii="Arial" w:cs="Arial" w:eastAsia="Arial" w:hAnsi="Arial"/>
+        <w:color w:val="6A6A6A"/>
+        <w:sz w:val="15"/>
+        <w:szCs w:val="15"/>
+      </w:rPr>
+      <w:t xml:space="preserve">BUTEC  /  BRIK ZINE EDDINE</w:t>
+    </w:r>
+    <w:r>
+      <w:rPr>
+        <w:rFonts w:ascii="Arial" w:cs="Arial" w:eastAsia="Arial" w:hAnsi="Arial"/>
+        <w:color w:val="6A6A6A"/>
+        <w:sz w:val="15"/>
+        <w:szCs w:val="15"/>
+      </w:rPr>
+      <w:t xml:space="preserve">	Page </w:t>
+    </w:r>
+    <w:r>
+      <w:rPr>
+        <w:rFonts w:ascii="Arial" w:cs="Arial" w:eastAsia="Arial" w:hAnsi="Arial"/>
+        <w:b w:val="false"/>
+        <w:bCs w:val="false"/>
+        <w:color w:val="6A6A6A"/>
+        <w:sz w:val="15"/>
+        <w:szCs w:val="15"/>
+      </w:rPr>
+      <w:fldChar w:fldCharType="begin"/>
+      <w:instrText xml:space="preserve">PAGE</w:instrText>
+      <w:fldChar w:fldCharType="separate"/>
+      <w:fldChar w:fldCharType="end"/>
+    </w:r>
+    <w:r>
+      <w:rPr>
+        <w:rFonts w:ascii="Arial" w:cs="Arial" w:eastAsia="Arial" w:hAnsi="Arial"/>
+        <w:color w:val="6A6A6A"/>
+        <w:sz w:val="15"/>
+        <w:szCs w:val="15"/>
+      </w:rPr>
+      <w:t xml:space="preserve"> of </w:t>
+    </w:r>
+    <w:r>
+      <w:rPr>
+        <w:rFonts w:ascii="Arial" w:cs="Arial" w:eastAsia="Arial" w:hAnsi="Arial"/>
+        <w:b w:val="false"/>
+        <w:bCs w:val="false"/>
+        <w:color w:val="6A6A6A"/>
+        <w:sz w:val="15"/>
+        <w:szCs w:val="15"/>
+      </w:rPr>
+      <w:fldChar w:fldCharType="begin"/>
+      <w:instrText xml:space="preserve">NUMPAGES</w:instrText>
+      <w:fldChar w:fldCharType="separate"/>
+      <w:fldChar w:fldCharType="end"/>
+    </w:r>
+  </w:p>
+</w:ftr>
+</file>
+
 <file path=word/footnotes.xml><?xml version="1.0" encoding="utf-8"?>
 <w:footnotes xmlns:wpc="http://schemas.microsoft.com/office/word/2010/wordprocessingCanvas" xmlns:mc="http://schemas.openxmlformats.org/markup-compatibility/2006" xmlns:o="urn:schemas-microsoft-com:office:office" xmlns:r="http://schemas.openxmlformats.org/officeDocument/2006/relationships" xmlns:m="http://schemas.openxmlformats.org/officeDocument/2006/math" xmlns:v="urn:schemas-microsoft-com:vml" xmlns:wp14="http://schemas.microsoft.com/office/word/2010/wordprocessingDrawing" xmlns:wp="http://schemas.openxmlformats.org/drawingml/2006/wordprocessingDrawing" xmlns:w10="urn:schemas-microsoft-com:office:word" xmlns:w="http://schemas.openxmlformats.org/wordprocessingml/2006/main" xmlns:w14="http://schemas.microsoft.com/office/word/2010/wordml" xmlns:w15="http://schemas.microsoft.com/office/word/2012/wordml" xmlns:wpg="http://schemas.microsoft.com/office/word/2010/wordprocessingGroup" xmlns:wpi="http://schemas.microsoft.com/office/word/2010/wordprocessingInk" xmlns:wne="http://schemas.microsoft.com/office/word/2006/wordml" xmlns:wps="http://schemas.microsoft.com/office/word/2010/wordprocessingShape" mc:Ignorable="w14 w15 wp14">
   <w:footnote w:type="separator" w:id="-1">
@@ -2955,6 +3071,74 @@
 </file>
 
 <file path=word/header1.xml><?xml version="1.0" encoding="utf-8"?>
+<w:hdr xmlns:wpc="http://schemas.microsoft.com/office/word/2010/wordprocessingCanvas" xmlns:mc="http://schemas.openxmlformats.org/markup-compatibility/2006" xmlns:o="urn:schemas-microsoft-com:office:office" xmlns:r="http://schemas.openxmlformats.org/officeDocument/2006/relationships" xmlns:m="http://schemas.openxmlformats.org/officeDocument/2006/math" xmlns:v="urn:schemas-microsoft-com:vml" xmlns:wp14="http://schemas.microsoft.com/office/word/2010/wordprocessingDrawing" xmlns:wp="http://schemas.openxmlformats.org/drawingml/2006/wordprocessingDrawing" xmlns:w10="urn:schemas-microsoft-com:office:word" xmlns:w="http://schemas.openxmlformats.org/wordprocessingml/2006/main" xmlns:w14="http://schemas.microsoft.com/office/word/2010/wordml" xmlns:w15="http://schemas.microsoft.com/office/word/2012/wordml" xmlns:wpg="http://schemas.microsoft.com/office/word/2010/wordprocessingGroup" xmlns:wpi="http://schemas.microsoft.com/office/word/2010/wordprocessingInk" xmlns:wne="http://schemas.microsoft.com/office/word/2006/wordml" xmlns:wps="http://schemas.microsoft.com/office/word/2010/wordprocessingShape" xmlns:cx="http://schemas.microsoft.com/office/drawing/2014/chartex" xmlns:cx1="http://schemas.microsoft.com/office/drawing/2015/9/8/chartex" xmlns:cx2="http://schemas.microsoft.com/office/drawing/2015/10/21/chartex" xmlns:cx3="http://schemas.microsoft.com/office/drawing/2016/5/9/chartex" xmlns:cx4="http://schemas.microsoft.com/office/drawing/2016/5/10/chartex" xmlns:cx5="http://schemas.microsoft.com/office/drawing/2016/5/11/chartex" xmlns:cx6="http://schemas.microsoft.com/office/drawing/2016/5/12/chartex" xmlns:cx7="http://schemas.microsoft.com/office/drawing/2016/5/13/chartex" xmlns:cx8="http://schemas.microsoft.com/office/drawing/2016/5/14/chartex" xmlns:w16cid="http://schemas.microsoft.com/office/word/2016/wordml/cid" xmlns:w16se="http://schemas.microsoft.com/office/word/2015/wordml/symex">
+  <w:p>
+    <w:pPr>
+      <w:pBdr>
+        <w:bottom w:val="single" w:color="FAA21C" w:sz="18" w:space="4"/>
+      </w:pBdr>
+      <w:tabs>
+        <w:tab w:val="right" w:pos="9866"/>
+      </w:tabs>
+      <w:spacing w:after="0"/>
+    </w:pPr>
+    <w:r>
+      <w:drawing>
+        <wp:inline distT="0" distB="0" distL="0" distR="0">
+          <wp:extent cx="609600" cy="152400"/>
+          <wp:effectExtent t="0" r="0" b="0" l="0"/>
+          <wp:docPr id="1" name="logo" descr="BUTEC logo" title="BUTEC"/>
+          <wp:cNvGraphicFramePr>
+            <a:graphicFrameLocks xmlns:a="http://schemas.openxmlformats.org/drawingml/2006/main" noChangeAspect="1"/>
+          </wp:cNvGraphicFramePr>
+          <a:graphic xmlns:a="http://schemas.openxmlformats.org/drawingml/2006/main">
+            <a:graphicData uri="http://schemas.openxmlformats.org/drawingml/2006/picture">
+              <pic:pic xmlns:pic="http://schemas.openxmlformats.org/drawingml/2006/picture">
+                <pic:nvPicPr>
+                  <pic:cNvPr id="0" name="" descr=""/>
+                  <pic:cNvPicPr>
+                    <a:picLocks noChangeAspect="1" noChangeArrowheads="1"/>
+                  </pic:cNvPicPr>
+                </pic:nvPicPr>
+                <pic:blipFill>
+                  <a:blip r:embed="rId0" cstate="none"/>
+                  <a:srcRect/>
+                  <a:stretch>
+                    <a:fillRect/>
+                  </a:stretch>
+                </pic:blipFill>
+                <pic:spPr bwMode="auto">
+                  <a:xfrm>
+                    <a:off x="0" y="0"/>
+                    <a:ext cx="609600" cy="152400"/>
+                  </a:xfrm>
+                  <a:prstGeom prst="rect">
+                    <a:avLst/>
+                  </a:prstGeom>
+                </pic:spPr>
+              </pic:pic>
+            </a:graphicData>
+          </a:graphic>
+        </wp:inline>
+      </w:drawing>
+    </w:r>
+    <w:r>
+      <w:rPr>
+        <w:rFonts w:ascii="Arial" w:cs="Arial" w:eastAsia="Arial" w:hAnsi="Arial"/>
+        <w:b/>
+        <w:bCs/>
+        <w:color w:val="6A6A6A"/>
+        <w:spacing w:val="60"/>
+        <w:sz w:val="15"/>
+        <w:szCs w:val="15"/>
+      </w:rPr>
+      <w:t xml:space="preserve">	PERSONNEL PROFILE</w:t>
+    </w:r>
+  </w:p>
+</w:hdr>
+</file>
+
+<file path=word/header2.xml><?xml version="1.0" encoding="utf-8"?>
 <w:hdr xmlns:wpc="http://schemas.microsoft.com/office/word/2010/wordprocessingCanvas" xmlns:mc="http://schemas.openxmlformats.org/markup-compatibility/2006" xmlns:o="urn:schemas-microsoft-com:office:office" xmlns:r="http://schemas.openxmlformats.org/officeDocument/2006/relationships" xmlns:m="http://schemas.openxmlformats.org/officeDocument/2006/math" xmlns:v="urn:schemas-microsoft-com:vml" xmlns:wp14="http://schemas.microsoft.com/office/word/2010/wordprocessingDrawing" xmlns:wp="http://schemas.openxmlformats.org/drawingml/2006/wordprocessingDrawing" xmlns:w10="urn:schemas-microsoft-com:office:word" xmlns:w="http://schemas.openxmlformats.org/wordprocessingml/2006/main" xmlns:w14="http://schemas.microsoft.com/office/word/2010/wordml" xmlns:w15="http://schemas.microsoft.com/office/word/2012/wordml" xmlns:wpg="http://schemas.microsoft.com/office/word/2010/wordprocessingGroup" xmlns:wpi="http://schemas.microsoft.com/office/word/2010/wordprocessingInk" xmlns:wne="http://schemas.microsoft.com/office/word/2006/wordml" xmlns:wps="http://schemas.microsoft.com/office/word/2010/wordprocessingShape" xmlns:cx="http://schemas.microsoft.com/office/drawing/2014/chartex" xmlns:cx1="http://schemas.microsoft.com/office/drawing/2015/9/8/chartex" xmlns:cx2="http://schemas.microsoft.com/office/drawing/2015/10/21/chartex" xmlns:cx3="http://schemas.microsoft.com/office/drawing/2016/5/9/chartex" xmlns:cx4="http://schemas.microsoft.com/office/drawing/2016/5/10/chartex" xmlns:cx5="http://schemas.microsoft.com/office/drawing/2016/5/11/chartex" xmlns:cx6="http://schemas.microsoft.com/office/drawing/2016/5/12/chartex" xmlns:cx7="http://schemas.microsoft.com/office/drawing/2016/5/13/chartex" xmlns:cx8="http://schemas.microsoft.com/office/drawing/2016/5/14/chartex" xmlns:w16cid="http://schemas.microsoft.com/office/word/2016/wordml/cid" xmlns:w16se="http://schemas.microsoft.com/office/word/2015/wordml/symex">
   <w:p>
     <w:pPr>

</xml_diff>